<commit_message>
docs(proposal): embed figures in Word export
</commit_message>
<xml_diff>
--- a/proposal/PharmaColdOps_正式Proposal_4人版.docx
+++ b/proposal/PharmaColdOps_正式Proposal_4人版.docx
@@ -1,6 +1,6 @@
 
 <file path=word/document.xml><?xml version="1.0" encoding="utf-8"?>
-<w:document xmlns:w="http://schemas.openxmlformats.org/wordprocessingml/2006/main" xmlns:r="http://schemas.openxmlformats.org/officeDocument/2006/relationships" xmlns:xml="http://www.w3.org/XML/1998/namespace">
+<w:document xmlns:w="http://schemas.openxmlformats.org/wordprocessingml/2006/main" xmlns:r="http://schemas.openxmlformats.org/officeDocument/2006/relationships" xmlns:xml="http://www.w3.org/XML/1998/namespace" xmlns:wp="http://schemas.openxmlformats.org/drawingml/2006/wordprocessingDrawing" xmlns:a="http://schemas.openxmlformats.org/drawingml/2006/main" xmlns:pic="http://schemas.openxmlformats.org/drawingml/2006/picture">
   <w:body>
     <w:p>
       <w:pPr>
@@ -411,18 +411,47 @@
     </w:p>
     <w:p>
       <w:pPr>
-        <w:spacing w:before="0" w:after="70" w:line="276" w:lineRule="auto"/>
+        <w:spacing w:before="120" w:after="90" w:line="276" w:lineRule="auto"/>
+        <w:jc w:val="center"/>
       </w:pPr>
       <w:r>
-        <w:rPr>
-          <w:rFonts w:ascii="Aptos" w:hAnsi="Aptos" w:eastAsia="Microsoft YaHei"/>
-          <w:sz w:val="20"/>
-          <w:szCs w:val="20"/>
-          <w:color w:val="000000"/>
-          <w:i/>
-          <w:iCs/>
-        </w:rPr>
-        <w:t>图示：图 1 能力与范围对照</w:t>
+        <w:drawing>
+          <wp:inline distT="0" distB="0" distL="0" distR="0">
+            <wp:extent cx="5669280" cy="3188970"/>
+            <wp:effectExtent l="0" t="0" r="0" b="0"/>
+            <wp:docPr id="1" name="图 1 能力与范围对照" descr="图 1 能力与范围对照"/>
+            <wp:cNvGraphicFramePr>
+              <a:graphicFrameLocks noChangeAspect="1"/>
+            </wp:cNvGraphicFramePr>
+            <a:graphic>
+              <a:graphicData uri="http://schemas.openxmlformats.org/drawingml/2006/picture">
+                <pic:pic>
+                  <pic:nvPicPr>
+                    <pic:cNvPr id="1" name="图 1 能力与范围对照"/>
+                    <pic:cNvPicPr>
+                      <a:picLocks noChangeAspect="1" noChangeArrowheads="1"/>
+                    </pic:cNvPicPr>
+                  </pic:nvPicPr>
+                  <pic:blipFill>
+                    <a:blip r:embed="rIdImg1"/>
+                    <a:stretch>
+                      <a:fillRect/>
+                    </a:stretch>
+                  </pic:blipFill>
+                  <pic:spPr bwMode="auto">
+                    <a:xfrm>
+                      <a:off x="0" y="0"/>
+                      <a:ext cx="5669280" cy="3188970"/>
+                    </a:xfrm>
+                    <a:prstGeom prst="rect">
+                      <a:avLst/>
+                    </a:prstGeom>
+                  </pic:spPr>
+                </pic:pic>
+              </a:graphicData>
+            </a:graphic>
+          </wp:inline>
+        </w:drawing>
       </w:r>
     </w:p>
     <w:p>
@@ -2139,18 +2168,47 @@
     </w:p>
     <w:p>
       <w:pPr>
-        <w:spacing w:before="0" w:after="70" w:line="276" w:lineRule="auto"/>
+        <w:spacing w:before="120" w:after="90" w:line="276" w:lineRule="auto"/>
+        <w:jc w:val="center"/>
       </w:pPr>
       <w:r>
-        <w:rPr>
-          <w:rFonts w:ascii="Aptos" w:hAnsi="Aptos" w:eastAsia="Microsoft YaHei"/>
-          <w:sz w:val="20"/>
-          <w:szCs w:val="20"/>
-          <w:color w:val="000000"/>
-          <w:i/>
-          <w:iCs/>
-        </w:rPr>
-        <w:t>图示：图 2 规则与输出语义</w:t>
+        <w:drawing>
+          <wp:inline distT="0" distB="0" distL="0" distR="0">
+            <wp:extent cx="5669280" cy="3838575"/>
+            <wp:effectExtent l="0" t="0" r="0" b="0"/>
+            <wp:docPr id="2" name="图 2 规则与输出语义" descr="图 2 规则与输出语义"/>
+            <wp:cNvGraphicFramePr>
+              <a:graphicFrameLocks noChangeAspect="1"/>
+            </wp:cNvGraphicFramePr>
+            <a:graphic>
+              <a:graphicData uri="http://schemas.openxmlformats.org/drawingml/2006/picture">
+                <pic:pic>
+                  <pic:nvPicPr>
+                    <pic:cNvPr id="2" name="图 2 规则与输出语义"/>
+                    <pic:cNvPicPr>
+                      <a:picLocks noChangeAspect="1" noChangeArrowheads="1"/>
+                    </pic:cNvPicPr>
+                  </pic:nvPicPr>
+                  <pic:blipFill>
+                    <a:blip r:embed="rIdImg2"/>
+                    <a:stretch>
+                      <a:fillRect/>
+                    </a:stretch>
+                  </pic:blipFill>
+                  <pic:spPr bwMode="auto">
+                    <a:xfrm>
+                      <a:off x="0" y="0"/>
+                      <a:ext cx="5669280" cy="3838575"/>
+                    </a:xfrm>
+                    <a:prstGeom prst="rect">
+                      <a:avLst/>
+                    </a:prstGeom>
+                  </pic:spPr>
+                </pic:pic>
+              </a:graphicData>
+            </a:graphic>
+          </wp:inline>
+        </w:drawing>
       </w:r>
     </w:p>
     <w:p>
@@ -2298,18 +2356,47 @@
     </w:p>
     <w:p>
       <w:pPr>
-        <w:spacing w:before="0" w:after="70" w:line="276" w:lineRule="auto"/>
+        <w:spacing w:before="120" w:after="90" w:line="276" w:lineRule="auto"/>
+        <w:jc w:val="center"/>
       </w:pPr>
       <w:r>
-        <w:rPr>
-          <w:rFonts w:ascii="Aptos" w:hAnsi="Aptos" w:eastAsia="Microsoft YaHei"/>
-          <w:sz w:val="20"/>
-          <w:szCs w:val="20"/>
-          <w:color w:val="000000"/>
-          <w:i/>
-          <w:iCs/>
-        </w:rPr>
-        <w:t>图示：图 3 新加坡配送算例</w:t>
+        <w:drawing>
+          <wp:inline distT="0" distB="0" distL="0" distR="0">
+            <wp:extent cx="5669280" cy="3366135"/>
+            <wp:effectExtent l="0" t="0" r="0" b="0"/>
+            <wp:docPr id="3" name="图 3 新加坡配送算例" descr="图 3 新加坡配送算例"/>
+            <wp:cNvGraphicFramePr>
+              <a:graphicFrameLocks noChangeAspect="1"/>
+            </wp:cNvGraphicFramePr>
+            <a:graphic>
+              <a:graphicData uri="http://schemas.openxmlformats.org/drawingml/2006/picture">
+                <pic:pic>
+                  <pic:nvPicPr>
+                    <pic:cNvPr id="3" name="图 3 新加坡配送算例"/>
+                    <pic:cNvPicPr>
+                      <a:picLocks noChangeAspect="1" noChangeArrowheads="1"/>
+                    </pic:cNvPicPr>
+                  </pic:nvPicPr>
+                  <pic:blipFill>
+                    <a:blip r:embed="rIdImg3"/>
+                    <a:stretch>
+                      <a:fillRect/>
+                    </a:stretch>
+                  </pic:blipFill>
+                  <pic:spPr bwMode="auto">
+                    <a:xfrm>
+                      <a:off x="0" y="0"/>
+                      <a:ext cx="5669280" cy="3366135"/>
+                    </a:xfrm>
+                    <a:prstGeom prst="rect">
+                      <a:avLst/>
+                    </a:prstGeom>
+                  </pic:spPr>
+                </pic:pic>
+              </a:graphicData>
+            </a:graphic>
+          </wp:inline>
+        </w:drawing>
       </w:r>
     </w:p>
     <w:p>
@@ -2398,18 +2485,47 @@
     </w:p>
     <w:p>
       <w:pPr>
-        <w:spacing w:before="0" w:after="70" w:line="276" w:lineRule="auto"/>
+        <w:spacing w:before="120" w:after="90" w:line="276" w:lineRule="auto"/>
+        <w:jc w:val="center"/>
       </w:pPr>
       <w:r>
-        <w:rPr>
-          <w:rFonts w:ascii="Aptos" w:hAnsi="Aptos" w:eastAsia="Microsoft YaHei"/>
-          <w:sz w:val="20"/>
-          <w:szCs w:val="20"/>
-          <w:color w:val="000000"/>
-          <w:i/>
-          <w:iCs/>
-        </w:rPr>
-        <w:t>图示：图 4 图谱概念与写入边界</w:t>
+        <w:drawing>
+          <wp:inline distT="0" distB="0" distL="0" distR="0">
+            <wp:extent cx="5669280" cy="3779520"/>
+            <wp:effectExtent l="0" t="0" r="0" b="0"/>
+            <wp:docPr id="4" name="图 4 图谱概念与写入边界" descr="图 4 图谱概念与写入边界"/>
+            <wp:cNvGraphicFramePr>
+              <a:graphicFrameLocks noChangeAspect="1"/>
+            </wp:cNvGraphicFramePr>
+            <a:graphic>
+              <a:graphicData uri="http://schemas.openxmlformats.org/drawingml/2006/picture">
+                <pic:pic>
+                  <pic:nvPicPr>
+                    <pic:cNvPr id="4" name="图 4 图谱概念与写入边界"/>
+                    <pic:cNvPicPr>
+                      <a:picLocks noChangeAspect="1" noChangeArrowheads="1"/>
+                    </pic:cNvPicPr>
+                  </pic:nvPicPr>
+                  <pic:blipFill>
+                    <a:blip r:embed="rIdImg4"/>
+                    <a:stretch>
+                      <a:fillRect/>
+                    </a:stretch>
+                  </pic:blipFill>
+                  <pic:spPr bwMode="auto">
+                    <a:xfrm>
+                      <a:off x="0" y="0"/>
+                      <a:ext cx="5669280" cy="3779520"/>
+                    </a:xfrm>
+                    <a:prstGeom prst="rect">
+                      <a:avLst/>
+                    </a:prstGeom>
+                  </pic:spPr>
+                </pic:pic>
+              </a:graphicData>
+            </a:graphic>
+          </wp:inline>
+        </w:drawing>
       </w:r>
     </w:p>
     <w:p>
@@ -2439,18 +2555,47 @@
     </w:p>
     <w:p>
       <w:pPr>
-        <w:spacing w:before="0" w:after="70" w:line="276" w:lineRule="auto"/>
+        <w:spacing w:before="120" w:after="90" w:line="276" w:lineRule="auto"/>
+        <w:jc w:val="center"/>
       </w:pPr>
       <w:r>
-        <w:rPr>
-          <w:rFonts w:ascii="Aptos" w:hAnsi="Aptos" w:eastAsia="Microsoft YaHei"/>
-          <w:sz w:val="20"/>
-          <w:szCs w:val="20"/>
-          <w:color w:val="000000"/>
-          <w:i/>
-          <w:iCs/>
-        </w:rPr>
-        <w:t>图示：演示 决策沙盒</w:t>
+        <w:drawing>
+          <wp:inline distT="0" distB="0" distL="0" distR="0">
+            <wp:extent cx="5669280" cy="9212580"/>
+            <wp:effectExtent l="0" t="0" r="0" b="0"/>
+            <wp:docPr id="5" name="演示 决策沙盒" descr="演示 决策沙盒"/>
+            <wp:cNvGraphicFramePr>
+              <a:graphicFrameLocks noChangeAspect="1"/>
+            </wp:cNvGraphicFramePr>
+            <a:graphic>
+              <a:graphicData uri="http://schemas.openxmlformats.org/drawingml/2006/picture">
+                <pic:pic>
+                  <pic:nvPicPr>
+                    <pic:cNvPr id="5" name="演示 决策沙盒"/>
+                    <pic:cNvPicPr>
+                      <a:picLocks noChangeAspect="1" noChangeArrowheads="1"/>
+                    </pic:cNvPicPr>
+                  </pic:nvPicPr>
+                  <pic:blipFill>
+                    <a:blip r:embed="rIdImg5"/>
+                    <a:stretch>
+                      <a:fillRect/>
+                    </a:stretch>
+                  </pic:blipFill>
+                  <pic:spPr bwMode="auto">
+                    <a:xfrm>
+                      <a:off x="0" y="0"/>
+                      <a:ext cx="5669280" cy="9212580"/>
+                    </a:xfrm>
+                    <a:prstGeom prst="rect">
+                      <a:avLst/>
+                    </a:prstGeom>
+                  </pic:spPr>
+                </pic:pic>
+              </a:graphicData>
+            </a:graphic>
+          </wp:inline>
+        </w:drawing>
       </w:r>
     </w:p>
     <w:p>
@@ -2480,18 +2625,47 @@
     </w:p>
     <w:p>
       <w:pPr>
-        <w:spacing w:before="0" w:after="70" w:line="276" w:lineRule="auto"/>
+        <w:spacing w:before="120" w:after="90" w:line="276" w:lineRule="auto"/>
+        <w:jc w:val="center"/>
       </w:pPr>
       <w:r>
-        <w:rPr>
-          <w:rFonts w:ascii="Aptos" w:hAnsi="Aptos" w:eastAsia="Microsoft YaHei"/>
-          <w:sz w:val="20"/>
-          <w:szCs w:val="20"/>
-          <w:color w:val="000000"/>
-          <w:i/>
-          <w:iCs/>
-        </w:rPr>
-        <w:t>图示：演示 路线和问答</w:t>
+        <w:drawing>
+          <wp:inline distT="0" distB="0" distL="0" distR="0">
+            <wp:extent cx="5669280" cy="7086600"/>
+            <wp:effectExtent l="0" t="0" r="0" b="0"/>
+            <wp:docPr id="6" name="演示 路线和问答" descr="演示 路线和问答"/>
+            <wp:cNvGraphicFramePr>
+              <a:graphicFrameLocks noChangeAspect="1"/>
+            </wp:cNvGraphicFramePr>
+            <a:graphic>
+              <a:graphicData uri="http://schemas.openxmlformats.org/drawingml/2006/picture">
+                <pic:pic>
+                  <pic:nvPicPr>
+                    <pic:cNvPr id="6" name="演示 路线和问答"/>
+                    <pic:cNvPicPr>
+                      <a:picLocks noChangeAspect="1" noChangeArrowheads="1"/>
+                    </pic:cNvPicPr>
+                  </pic:nvPicPr>
+                  <pic:blipFill>
+                    <a:blip r:embed="rIdImg6"/>
+                    <a:stretch>
+                      <a:fillRect/>
+                    </a:stretch>
+                  </pic:blipFill>
+                  <pic:spPr bwMode="auto">
+                    <a:xfrm>
+                      <a:off x="0" y="0"/>
+                      <a:ext cx="5669280" cy="7086600"/>
+                    </a:xfrm>
+                    <a:prstGeom prst="rect">
+                      <a:avLst/>
+                    </a:prstGeom>
+                  </pic:spPr>
+                </pic:pic>
+              </a:graphicData>
+            </a:graphic>
+          </wp:inline>
+        </w:drawing>
       </w:r>
     </w:p>
     <w:p>
@@ -2552,18 +2726,47 @@
     </w:p>
     <w:p>
       <w:pPr>
-        <w:spacing w:before="0" w:after="70" w:line="276" w:lineRule="auto"/>
+        <w:spacing w:before="120" w:after="90" w:line="276" w:lineRule="auto"/>
+        <w:jc w:val="center"/>
       </w:pPr>
       <w:r>
-        <w:rPr>
-          <w:rFonts w:ascii="Aptos" w:hAnsi="Aptos" w:eastAsia="Microsoft YaHei"/>
-          <w:sz w:val="20"/>
-          <w:szCs w:val="20"/>
-          <w:color w:val="000000"/>
-          <w:i/>
-          <w:iCs/>
-        </w:rPr>
-        <w:t>图示：图 5 当前架构</w:t>
+        <w:drawing>
+          <wp:inline distT="0" distB="0" distL="0" distR="0">
+            <wp:extent cx="5669280" cy="4015740"/>
+            <wp:effectExtent l="0" t="0" r="0" b="0"/>
+            <wp:docPr id="7" name="图 5 当前架构" descr="图 5 当前架构"/>
+            <wp:cNvGraphicFramePr>
+              <a:graphicFrameLocks noChangeAspect="1"/>
+            </wp:cNvGraphicFramePr>
+            <a:graphic>
+              <a:graphicData uri="http://schemas.openxmlformats.org/drawingml/2006/picture">
+                <pic:pic>
+                  <pic:nvPicPr>
+                    <pic:cNvPr id="7" name="图 5 当前架构"/>
+                    <pic:cNvPicPr>
+                      <a:picLocks noChangeAspect="1" noChangeArrowheads="1"/>
+                    </pic:cNvPicPr>
+                  </pic:nvPicPr>
+                  <pic:blipFill>
+                    <a:blip r:embed="rIdImg7"/>
+                    <a:stretch>
+                      <a:fillRect/>
+                    </a:stretch>
+                  </pic:blipFill>
+                  <pic:spPr bwMode="auto">
+                    <a:xfrm>
+                      <a:off x="0" y="0"/>
+                      <a:ext cx="5669280" cy="4015740"/>
+                    </a:xfrm>
+                    <a:prstGeom prst="rect">
+                      <a:avLst/>
+                    </a:prstGeom>
+                  </pic:spPr>
+                </pic:pic>
+              </a:graphicData>
+            </a:graphic>
+          </wp:inline>
+        </w:drawing>
       </w:r>
     </w:p>
     <w:p>
@@ -2607,18 +2810,47 @@
     </w:p>
     <w:p>
       <w:pPr>
-        <w:spacing w:before="0" w:after="70" w:line="276" w:lineRule="auto"/>
+        <w:spacing w:before="120" w:after="90" w:line="276" w:lineRule="auto"/>
+        <w:jc w:val="center"/>
       </w:pPr>
       <w:r>
-        <w:rPr>
-          <w:rFonts w:ascii="Aptos" w:hAnsi="Aptos" w:eastAsia="Microsoft YaHei"/>
-          <w:sz w:val="20"/>
-          <w:szCs w:val="20"/>
-          <w:color w:val="000000"/>
-          <w:i/>
-          <w:iCs/>
-        </w:rPr>
-        <w:t>图示：图 6 最小闭环目标</w:t>
+        <w:drawing>
+          <wp:inline distT="0" distB="0" distL="0" distR="0">
+            <wp:extent cx="5669280" cy="3779520"/>
+            <wp:effectExtent l="0" t="0" r="0" b="0"/>
+            <wp:docPr id="8" name="图 6 最小闭环目标" descr="图 6 最小闭环目标"/>
+            <wp:cNvGraphicFramePr>
+              <a:graphicFrameLocks noChangeAspect="1"/>
+            </wp:cNvGraphicFramePr>
+            <a:graphic>
+              <a:graphicData uri="http://schemas.openxmlformats.org/drawingml/2006/picture">
+                <pic:pic>
+                  <pic:nvPicPr>
+                    <pic:cNvPr id="8" name="图 6 最小闭环目标"/>
+                    <pic:cNvPicPr>
+                      <a:picLocks noChangeAspect="1" noChangeArrowheads="1"/>
+                    </pic:cNvPicPr>
+                  </pic:nvPicPr>
+                  <pic:blipFill>
+                    <a:blip r:embed="rIdImg8"/>
+                    <a:stretch>
+                      <a:fillRect/>
+                    </a:stretch>
+                  </pic:blipFill>
+                  <pic:spPr bwMode="auto">
+                    <a:xfrm>
+                      <a:off x="0" y="0"/>
+                      <a:ext cx="5669280" cy="3779520"/>
+                    </a:xfrm>
+                    <a:prstGeom prst="rect">
+                      <a:avLst/>
+                    </a:prstGeom>
+                  </pic:spPr>
+                </pic:pic>
+              </a:graphicData>
+            </a:graphic>
+          </wp:inline>
+        </w:drawing>
       </w:r>
     </w:p>
     <w:p>
@@ -7416,18 +7648,47 @@
     </w:tbl>
     <w:p>
       <w:pPr>
-        <w:spacing w:before="0" w:after="70" w:line="276" w:lineRule="auto"/>
+        <w:spacing w:before="120" w:after="90" w:line="276" w:lineRule="auto"/>
+        <w:jc w:val="center"/>
       </w:pPr>
       <w:r>
-        <w:rPr>
-          <w:rFonts w:ascii="Aptos" w:hAnsi="Aptos" w:eastAsia="Microsoft YaHei"/>
-          <w:sz w:val="20"/>
-          <w:szCs w:val="20"/>
-          <w:color w:val="000000"/>
-          <w:i/>
-          <w:iCs/>
-        </w:rPr>
-        <w:t>图示：图 7 周计划</w:t>
+        <w:drawing>
+          <wp:inline distT="0" distB="0" distL="0" distR="0">
+            <wp:extent cx="5669280" cy="3720465"/>
+            <wp:effectExtent l="0" t="0" r="0" b="0"/>
+            <wp:docPr id="9" name="图 7 周计划" descr="图 7 周计划"/>
+            <wp:cNvGraphicFramePr>
+              <a:graphicFrameLocks noChangeAspect="1"/>
+            </wp:cNvGraphicFramePr>
+            <a:graphic>
+              <a:graphicData uri="http://schemas.openxmlformats.org/drawingml/2006/picture">
+                <pic:pic>
+                  <pic:nvPicPr>
+                    <pic:cNvPr id="9" name="图 7 周计划"/>
+                    <pic:cNvPicPr>
+                      <a:picLocks noChangeAspect="1" noChangeArrowheads="1"/>
+                    </pic:cNvPicPr>
+                  </pic:nvPicPr>
+                  <pic:blipFill>
+                    <a:blip r:embed="rIdImg9"/>
+                    <a:stretch>
+                      <a:fillRect/>
+                    </a:stretch>
+                  </pic:blipFill>
+                  <pic:spPr bwMode="auto">
+                    <a:xfrm>
+                      <a:off x="0" y="0"/>
+                      <a:ext cx="5669280" cy="3720465"/>
+                    </a:xfrm>
+                    <a:prstGeom prst="rect">
+                      <a:avLst/>
+                    </a:prstGeom>
+                  </pic:spPr>
+                </pic:pic>
+              </a:graphicData>
+            </a:graphic>
+          </wp:inline>
+        </w:drawing>
       </w:r>
     </w:p>
     <w:p>

</xml_diff>

<commit_message>
docs(proposal): 按实测对齐 KG/问答状态并补 Neo4j Browser 实拍图
- ZH/EN 正文：§1 现状、§5.1 工作流第 4/5 步、§6.4 配送优化、§6.5 知识图谱与问答、§6.6 跨成员契约、模块总览表 M5/M6/M7 —— 把「仍待集成 / 仍为 501 / 概念示意 / 待接线」等过期表述改为已落地并标注日期
- 明确写出仍未完成项（结案表单未传设施字段、重复结案无去重）与评估口径（466/466 派生检查、准确率待人工标注）
- 新增图 4b：proposal/figures/kg-neo4j-browser.png（Neo4j Browser 实拍案例链路，顶部即实际查询语句）
- 同步修订 5 张配图的过期标注（fig1/3/4/5/6）与 proposal/README.md 版本说明；中文 Word 已按本版重建
</commit_message>
<xml_diff>
--- a/proposal/PharmaColdOps_正式Proposal_4人版.docx
+++ b/proposal/PharmaColdOps_正式Proposal_4人版.docx
@@ -136,7 +136,7 @@
           <w:szCs w:val="21"/>
           <w:color w:val="000000"/>
         </w:rPr>
-        <w:t>截至 2026-09-12，规则引擎、双语界面、独立标注场景库、离线 ML 基线、新加坡路线求解及 KG 结案写入代码已有成果；事件触发路线求解和前端真实图谱问答仍待集成。本原型不替代质量负责人的最终审批，不宣称已通过生产环境或正式合规验证。</w:t>
+        <w:t>截至 2026-09-12，规则引擎、双语界面、独立标注场景库、离线 ML 基线、新加坡路线求解及 KG 结案写入代码已有成果；2026-09-13 事件触发路线求解（/api/route 按已结案案例求解补发路线）与前端真实图谱问答（/api/qa 查询真实图谱并返回证据）已在本地 Neo4j 上完成端到端复核。本原型不替代质量负责人的最终审批，不宣称已通过生产环境或正式合规验证。</w:t>
       </w:r>
     </w:p>
     <w:p>
@@ -1035,7 +1035,7 @@
           <w:szCs w:val="21"/>
           <w:color w:val="000000"/>
         </w:rPr>
-        <w:t>4. 需要补发时，依据确认后的契约生成含目的地、数量与时间窗的模拟补发单，触发单仓求解。该连接尚未完成。</w:t>
+        <w:t>4. 需要补发时，依据已定契约生成含目的地、数量与时间窗的模拟补发单，触发单仓求解（/api/route 按 run_id 读取已结案案例）。该连接已于 2026-09-12 落地，并在 9/13 完成端到端复核。</w:t>
       </w:r>
     </w:p>
     <w:p>
@@ -1050,7 +1050,7 @@
           <w:szCs w:val="21"/>
           <w:color w:val="000000"/>
         </w:rPr>
-        <w:t>5. 关联案例和配送结果，展示站序、距离、排程与未服务订单，并查询本次案例的图谱证据。路线关联与前端查询接线尚未完成。</w:t>
+        <w:t>5. 关联案例和配送结果，展示站序、距离、排程与未服务订单，并查询本次案例的图谱证据。案例—订单—路线—证据的关联与前端查询接线已于 2026-09-12 接通（离线模式保留固定演示路线与关键词问答兜底）。</w:t>
       </w:r>
     </w:p>
     <w:p>
@@ -1566,7 +1566,7 @@
                 <w:szCs w:val="19"/>
                 <w:color w:val="000000"/>
               </w:rPr>
-              <w:t>贪心、Routing Solver、真实路网、预计算展示已有</w:t>
+              <w:t>贪心、Routing Solver、真实路网已有；补发契约与事件触发求解 9/12 落地</w:t>
             </w:r>
           </w:p>
         </w:tc>
@@ -1592,7 +1592,7 @@
                 <w:szCs w:val="19"/>
                 <w:color w:val="000000"/>
               </w:rPr>
-              <w:t>补发契约与事件触发求解</w:t>
+              <w:t>替代库存选择、多温区与碳排放目标</w:t>
             </w:r>
           </w:p>
         </w:tc>
@@ -1648,7 +1648,7 @@
                 <w:szCs w:val="19"/>
                 <w:color w:val="000000"/>
               </w:rPr>
-              <w:t>schema、加载、结案写入、查询函数已有</w:t>
+              <w:t>schema、加载、结案写入、查询函数已有；HTTP 与前端接线 9/12 落地，9/13 完成数据库端到端验证</w:t>
             </w:r>
           </w:p>
         </w:tc>
@@ -1675,7 +1675,7 @@
                 <w:szCs w:val="19"/>
                 <w:color w:val="000000"/>
               </w:rPr>
-              <w:t>HTTP、前端接线与证据评估</w:t>
+              <w:t>四态状态字段与问答评估集</w:t>
             </w:r>
           </w:p>
         </w:tc>
@@ -1729,7 +1729,7 @@
                 <w:szCs w:val="19"/>
                 <w:color w:val="000000"/>
               </w:rPr>
-              <w:t>Vue 双语、离线/API 双模式、结案历史已有</w:t>
+              <w:t>Vue 双语、离线/API 双模式、结案历史已有；结案→路线→证据闭环 9/12–9/13 接通</w:t>
             </w:r>
           </w:p>
         </w:tc>
@@ -1755,7 +1755,7 @@
                 <w:szCs w:val="19"/>
                 <w:color w:val="000000"/>
               </w:rPr>
-              <w:t>闭环验收与故障状态检查</w:t>
+              <w:t>失败态细化与干净环境复现</w:t>
             </w:r>
           </w:p>
         </w:tc>
@@ -2351,7 +2351,7 @@
           <w:szCs w:val="21"/>
           <w:color w:val="000000"/>
         </w:rPr>
-        <w:t>当前 Vue 展示预计算路线，温度变化不触发重求解。MVP 将补齐单仓补发单到求解器的映射；替代库存选择、多温区、碳排放和报废损失目标列为扩展。遗传算法仅在主链验收后考虑，不作为必交算法。</w:t>
+        <w:t>在线模式下 Vue 按已结案案例实时求解并展示路线，离线或未结案时回退预计算演示路线；温度变化本身不触发重求解。单仓补发单到求解器的映射已于 9/12 落地；替代库存选择、多温区、碳排放和报废损失目标列为扩展。遗传算法仅在主链验收后考虑，不作为必交算法。</w:t>
       </w:r>
     </w:p>
     <w:p>
@@ -2466,7 +2466,7 @@
           <w:szCs w:val="21"/>
           <w:color w:val="000000"/>
         </w:rPr>
-        <w:t>case_close 保存记录并尝试写入图谱，decide 预览不归档。Cause 目前来自 API 启发式原因代码，不是 ML 推断或调查证实的根因。补发节点已有写入逻辑，但不意味着订单已求解或执行。日志与图谱均采用尽力保存，尚不具备审计级持久性保证。</w:t>
+        <w:t>case_close 保存记录并尝试写入图谱，decide 预览不归档。Cause 目前来自 API 启发式原因代码，不是 ML 推断或调查证实的根因。补发单在调用 /api/route 时按案例求解，但求解不代表订单已执行（不产生任何实际运输动作）。日志与图谱均采用尽力保存，尚不具备审计级持久性保证。</w:t>
       </w:r>
     </w:p>
     <w:p>
@@ -2480,7 +2480,87 @@
           <w:szCs w:val="21"/>
           <w:color w:val="000000"/>
         </w:rPr>
-        <w:t>Python 已有按 run_id 查询处置理由、审计链、产品要求及统计的函数；/api/qa 仍为 501，前端为关键词模板概念示意。交付版将采用受限意图识别与参数化 Cypher，返回本次案例的证据，并区分无案例、证据不足、不支持的问题和数据库故障。评估要求证据与具体规则匹配，不能以“有法规链接”代替验证。LLM 不属于 MVP 必需组件。</w:t>
+        <w:t>Python 已有按 run_id 查询处置理由、审计链、产品要求及统计的函数。</w:t>
+      </w:r>
+      <w:r>
+        <w:rPr>
+          <w:rFonts w:ascii="Aptos" w:hAnsi="Aptos" w:eastAsia="Microsoft YaHei"/>
+          <w:sz w:val="21"/>
+          <w:szCs w:val="21"/>
+          <w:color w:val="000000"/>
+          <w:b/>
+          <w:bCs/>
+        </w:rPr>
+        <w:t>2026-09-13 起 /api/qa 已从 501 变为真实现</w:t>
+      </w:r>
+      <w:r>
+        <w:rPr>
+          <w:rFonts w:ascii="Aptos" w:hAnsi="Aptos" w:eastAsia="Microsoft YaHei"/>
+          <w:sz w:val="21"/>
+          <w:szCs w:val="21"/>
+          <w:color w:val="000000"/>
+        </w:rPr>
+        <w:t>：受限意图识别（客户端把问句映射到 5 类结构化问题：为何这样判定 / 审计链 / 产品要求 / 该原因最常见场景 / 处置统计，非自然语言分类）+ 参数化 Cypher，返回本次案例的证据节点；前端 Vue 在线模式直接调用该端点，离线保留关键词模板兜底。已在 docker compose 启动的 Neo4j 上完成数据库端到端验证（结案 → 写图谱 → 按案例查证据，证据集合与触发规则的法规/SOP 映射逐条一致；全量 132 passed / 0 failed / 0 xfailed）。</w:t>
+      </w:r>
+      <w:r>
+        <w:rPr>
+          <w:rFonts w:ascii="Aptos" w:hAnsi="Aptos" w:eastAsia="Microsoft YaHei"/>
+          <w:sz w:val="21"/>
+          <w:szCs w:val="21"/>
+          <w:color w:val="000000"/>
+          <w:b/>
+          <w:bCs/>
+        </w:rPr>
+        <w:t>同日补齐四态、证据作用域与评估</w:t>
+      </w:r>
+      <w:r>
+        <w:rPr>
+          <w:rFonts w:ascii="Aptos" w:hAnsi="Aptos" w:eastAsia="Microsoft YaHei"/>
+          <w:sz w:val="21"/>
+          <w:szCs w:val="21"/>
+          <w:color w:val="000000"/>
+        </w:rPr>
+        <w:t>：响应带机器可读的 status（ok / 无案例 / 证据不足 / 不支持的问题；数据库故障仍以 503 表达），前端按状态渲染本地化提示；补发单与补发目的地已进入审计链的证据与答案；「该原因最常见场景」由本案例主因码聚合全部结案的 stage/product 分布；并修正 CITES 原先挂在共享 Disposition 节点上、导致同处置不同规则的案例互相串证据的缺陷（现为案例级）。问答评估集与评测脚本见 data/qa/ 与 scripts/evaluate_qa.py：57 条场景上</w:t>
+      </w:r>
+      <w:r>
+        <w:rPr>
+          <w:rFonts w:ascii="Aptos" w:hAnsi="Aptos" w:eastAsia="Microsoft YaHei"/>
+          <w:sz w:val="21"/>
+          <w:szCs w:val="21"/>
+          <w:color w:val="000000"/>
+          <w:b/>
+          <w:bCs/>
+        </w:rPr>
+        <w:t>466/466</w:t>
+      </w:r>
+      <w:r>
+        <w:rPr>
+          <w:rFonts w:ascii="Aptos" w:hAnsi="Aptos" w:eastAsia="Microsoft YaHei"/>
+          <w:sz w:val="21"/>
+          <w:szCs w:val="21"/>
+          <w:color w:val="000000"/>
+        </w:rPr>
+        <w:t>派生检查通过（期望值取自静态映射与 rules_config.json，非循环验证），意图分类准确率待人工标注。</w:t>
+      </w:r>
+      <w:r>
+        <w:rPr>
+          <w:rFonts w:ascii="Aptos" w:hAnsi="Aptos" w:eastAsia="Microsoft YaHei"/>
+          <w:sz w:val="21"/>
+          <w:szCs w:val="21"/>
+          <w:color w:val="000000"/>
+          <w:b/>
+          <w:bCs/>
+        </w:rPr>
+        <w:t>仍未完成</w:t>
+      </w:r>
+      <w:r>
+        <w:rPr>
+          <w:rFonts w:ascii="Aptos" w:hAnsi="Aptos" w:eastAsia="Microsoft YaHei"/>
+          <w:sz w:val="21"/>
+          <w:szCs w:val="21"/>
+          <w:color w:val="000000"/>
+        </w:rPr>
+        <w:t>：结案表单尚未传异常地点/补发目的地（设施级证据需经 API 传参才会出现）；重复结案尚无去重。评估要求证据与具体规则匹配，不能以“有法规链接”代替验证。LLM 不属于 MVP 必需组件。</w:t>
       </w:r>
     </w:p>
     <w:p>
@@ -2550,7 +2630,77 @@
           <w:szCs w:val="21"/>
           <w:color w:val="000000"/>
         </w:rPr>
-        <w:t>案例链概念视图；设施、运输和路线关联受输入契约限制。</w:t>
+        <w:t>案例链视图；设施、运输与路线的关联由输入契约给定（异常地点/补发目的地字段已定义，结案表单尚未传入）。</w:t>
+      </w:r>
+    </w:p>
+    <w:p>
+      <w:pPr>
+        <w:spacing w:before="120" w:after="90" w:line="276" w:lineRule="auto"/>
+        <w:jc w:val="center"/>
+      </w:pPr>
+      <w:r>
+        <w:drawing>
+          <wp:inline distT="0" distB="0" distL="0" distR="0">
+            <wp:extent cx="5669280" cy="3543300"/>
+            <wp:effectExtent l="0" t="0" r="0" b="0"/>
+            <wp:docPr id="5" name="图 4b Neo4j Browser 实拍：一个结案案例的图谱链路" descr="图 4b Neo4j Browser 实拍：一个结案案例的图谱链路"/>
+            <wp:cNvGraphicFramePr>
+              <a:graphicFrameLocks noChangeAspect="1"/>
+            </wp:cNvGraphicFramePr>
+            <a:graphic>
+              <a:graphicData uri="http://schemas.openxmlformats.org/drawingml/2006/picture">
+                <pic:pic>
+                  <pic:nvPicPr>
+                    <pic:cNvPr id="5" name="图 4b Neo4j Browser 实拍：一个结案案例的图谱链路"/>
+                    <pic:cNvPicPr>
+                      <a:picLocks noChangeAspect="1" noChangeArrowheads="1"/>
+                    </pic:cNvPicPr>
+                  </pic:nvPicPr>
+                  <pic:blipFill>
+                    <a:blip r:embed="rIdImg5"/>
+                    <a:stretch>
+                      <a:fillRect/>
+                    </a:stretch>
+                  </pic:blipFill>
+                  <pic:spPr bwMode="auto">
+                    <a:xfrm>
+                      <a:off x="0" y="0"/>
+                      <a:ext cx="5669280" cy="3543300"/>
+                    </a:xfrm>
+                    <a:prstGeom prst="rect">
+                      <a:avLst/>
+                    </a:prstGeom>
+                  </pic:spPr>
+                </pic:pic>
+              </a:graphicData>
+            </a:graphic>
+          </wp:inline>
+        </w:drawing>
+      </w:r>
+    </w:p>
+    <w:p>
+      <w:pPr>
+        <w:spacing w:before="0" w:after="95" w:line="276" w:lineRule="auto"/>
+      </w:pPr>
+      <w:r>
+        <w:rPr>
+          <w:rFonts w:ascii="Aptos" w:hAnsi="Aptos" w:eastAsia="Microsoft YaHei"/>
+          <w:sz w:val="21"/>
+          <w:szCs w:val="21"/>
+          <w:color w:val="000000"/>
+          <w:b/>
+          <w:bCs/>
+        </w:rPr>
+        <w:t>图 4b：</w:t>
+      </w:r>
+      <w:r>
+        <w:rPr>
+          <w:rFonts w:ascii="Aptos" w:hAnsi="Aptos" w:eastAsia="Microsoft YaHei"/>
+          <w:sz w:val="21"/>
+          <w:szCs w:val="21"/>
+          <w:color w:val="000000"/>
+        </w:rPr>
+        <w:t>2026-09-13 从 Neo4j Browser 实拍的一个结案案例链路（9 节点 / 8 类关系）：超限事件 → 主因与处置 + 该规则引用的法规与 SOP → 发生设施与补发目的地；顶部为实际执行的查询语句（可复现），右侧列举各节点/关系类型及计数。</w:t>
       </w:r>
     </w:p>
     <w:p>
@@ -2563,7 +2713,7 @@
           <wp:inline distT="0" distB="0" distL="0" distR="0">
             <wp:extent cx="5669280" cy="9212580"/>
             <wp:effectExtent l="0" t="0" r="0" b="0"/>
-            <wp:docPr id="5" name="演示 决策沙盒" descr="演示 决策沙盒"/>
+            <wp:docPr id="6" name="演示 决策沙盒" descr="演示 决策沙盒"/>
             <wp:cNvGraphicFramePr>
               <a:graphicFrameLocks noChangeAspect="1"/>
             </wp:cNvGraphicFramePr>
@@ -2571,13 +2721,13 @@
               <a:graphicData uri="http://schemas.openxmlformats.org/drawingml/2006/picture">
                 <pic:pic>
                   <pic:nvPicPr>
-                    <pic:cNvPr id="5" name="演示 决策沙盒"/>
+                    <pic:cNvPr id="6" name="演示 决策沙盒"/>
                     <pic:cNvPicPr>
                       <a:picLocks noChangeAspect="1" noChangeArrowheads="1"/>
                     </pic:cNvPicPr>
                   </pic:nvPicPr>
                   <pic:blipFill>
-                    <a:blip r:embed="rIdImg5"/>
+                    <a:blip r:embed="rIdImg6"/>
                     <a:stretch>
                       <a:fillRect/>
                     </a:stretch>
@@ -2633,7 +2783,7 @@
           <wp:inline distT="0" distB="0" distL="0" distR="0">
             <wp:extent cx="5669280" cy="7086600"/>
             <wp:effectExtent l="0" t="0" r="0" b="0"/>
-            <wp:docPr id="6" name="演示 路线和问答" descr="演示 路线和问答"/>
+            <wp:docPr id="7" name="演示 路线和问答" descr="演示 路线和问答"/>
             <wp:cNvGraphicFramePr>
               <a:graphicFrameLocks noChangeAspect="1"/>
             </wp:cNvGraphicFramePr>
@@ -2641,13 +2791,13 @@
               <a:graphicData uri="http://schemas.openxmlformats.org/drawingml/2006/picture">
                 <pic:pic>
                   <pic:nvPicPr>
-                    <pic:cNvPr id="6" name="演示 路线和问答"/>
+                    <pic:cNvPr id="7" name="演示 路线和问答"/>
                     <pic:cNvPicPr>
                       <a:picLocks noChangeAspect="1" noChangeArrowheads="1"/>
                     </pic:cNvPicPr>
                   </pic:nvPicPr>
                   <pic:blipFill>
-                    <a:blip r:embed="rIdImg6"/>
+                    <a:blip r:embed="rIdImg7"/>
                     <a:stretch>
                       <a:fillRect/>
                     </a:stretch>
@@ -2681,7 +2831,7 @@
           <w:b/>
           <w:bCs/>
         </w:rPr>
-        <w:t>演示（2026-09-12）：</w:t>
+        <w:t>演示（2026-09-12 截图，2026-09-13 复核）：</w:t>
       </w:r>
       <w:r>
         <w:rPr>
@@ -2690,7 +2840,7 @@
           <w:szCs w:val="21"/>
           <w:color w:val="000000"/>
         </w:rPr>
-        <w:t>固定预计算路线与问答概念示意，不能作为目标闭环已接通的证明。</w:t>
+        <w:t>在线模式下路线与问答均由后端实时计算（/api/route 按案例求解补发路线、/api/qa 查询真实图谱并返回证据）；本图为演示截图，闭环是否接通以 9/13 的端到端复核为准。</w:t>
       </w:r>
     </w:p>
     <w:p>
@@ -2734,7 +2884,7 @@
           <wp:inline distT="0" distB="0" distL="0" distR="0">
             <wp:extent cx="5669280" cy="4015740"/>
             <wp:effectExtent l="0" t="0" r="0" b="0"/>
-            <wp:docPr id="7" name="图 5 当前架构" descr="图 5 当前架构"/>
+            <wp:docPr id="8" name="图 5 当前架构" descr="图 5 当前架构"/>
             <wp:cNvGraphicFramePr>
               <a:graphicFrameLocks noChangeAspect="1"/>
             </wp:cNvGraphicFramePr>
@@ -2742,13 +2892,13 @@
               <a:graphicData uri="http://schemas.openxmlformats.org/drawingml/2006/picture">
                 <pic:pic>
                   <pic:nvPicPr>
-                    <pic:cNvPr id="7" name="图 5 当前架构"/>
+                    <pic:cNvPr id="8" name="图 5 当前架构"/>
                     <pic:cNvPicPr>
                       <a:picLocks noChangeAspect="1" noChangeArrowheads="1"/>
                     </pic:cNvPicPr>
                   </pic:nvPicPr>
                   <pic:blipFill>
-                    <a:blip r:embed="rIdImg7"/>
+                    <a:blip r:embed="rIdImg8"/>
                     <a:stretch>
                       <a:fillRect/>
                     </a:stretch>
@@ -2791,7 +2941,7 @@
           <w:szCs w:val="21"/>
           <w:color w:val="000000"/>
         </w:rPr>
-        <w:t>区分在线规则主链、离线实验、预计算路线和待接线接口。</w:t>
+        <w:t>在线规则主链、离线实验、路线求解与图谱问答四层的接线状态；截至 2026-09-13，事件触发路线求解与前端真实图谱问答均已接通。</w:t>
       </w:r>
     </w:p>
     <w:p>
@@ -2818,7 +2968,7 @@
           <wp:inline distT="0" distB="0" distL="0" distR="0">
             <wp:extent cx="5669280" cy="3779520"/>
             <wp:effectExtent l="0" t="0" r="0" b="0"/>
-            <wp:docPr id="8" name="图 6 最小闭环目标" descr="图 6 最小闭环目标"/>
+            <wp:docPr id="9" name="图 6 最小闭环目标" descr="图 6 最小闭环目标"/>
             <wp:cNvGraphicFramePr>
               <a:graphicFrameLocks noChangeAspect="1"/>
             </wp:cNvGraphicFramePr>
@@ -2826,13 +2976,13 @@
               <a:graphicData uri="http://schemas.openxmlformats.org/drawingml/2006/picture">
                 <pic:pic>
                   <pic:nvPicPr>
-                    <pic:cNvPr id="8" name="图 6 最小闭环目标"/>
+                    <pic:cNvPr id="9" name="图 6 最小闭环目标"/>
                     <pic:cNvPicPr>
                       <a:picLocks noChangeAspect="1" noChangeArrowheads="1"/>
                     </pic:cNvPicPr>
                   </pic:nvPicPr>
                   <pic:blipFill>
-                    <a:blip r:embed="rIdImg8"/>
+                    <a:blip r:embed="rIdImg9"/>
                     <a:stretch>
                       <a:fillRect/>
                     </a:stretch>
@@ -2875,7 +3025,7 @@
           <w:szCs w:val="21"/>
           <w:color w:val="000000"/>
         </w:rPr>
-        <w:t>W3 集成验收目标。核心模块已有实现，连接部分仍待完成。</w:t>
+        <w:t>W3 集成验收目标。核心模块与主要连接（结案 → 订单 → 路线 → 证据查询）已于 9/12–9/13 接通；尚缺人工复核/审批字段。</w:t>
       </w:r>
     </w:p>
     <w:p>
@@ -7656,7 +7806,7 @@
           <wp:inline distT="0" distB="0" distL="0" distR="0">
             <wp:extent cx="5669280" cy="3720465"/>
             <wp:effectExtent l="0" t="0" r="0" b="0"/>
-            <wp:docPr id="9" name="图 7 周计划" descr="图 7 周计划"/>
+            <wp:docPr id="10" name="图 7 周计划" descr="图 7 周计划"/>
             <wp:cNvGraphicFramePr>
               <a:graphicFrameLocks noChangeAspect="1"/>
             </wp:cNvGraphicFramePr>
@@ -7664,13 +7814,13 @@
               <a:graphicData uri="http://schemas.openxmlformats.org/drawingml/2006/picture">
                 <pic:pic>
                   <pic:nvPicPr>
-                    <pic:cNvPr id="9" name="图 7 周计划"/>
+                    <pic:cNvPr id="10" name="图 7 周计划"/>
                     <pic:cNvPicPr>
                       <a:picLocks noChangeAspect="1" noChangeArrowheads="1"/>
                     </pic:cNvPicPr>
                   </pic:nvPicPr>
                   <pic:blipFill>
-                    <a:blip r:embed="rIdImg9"/>
+                    <a:blip r:embed="rIdImg10"/>
                     <a:stretch>
                       <a:fillRect/>
                     </a:stretch>

</xml_diff>